<commit_message>
fixed resume formating issue
</commit_message>
<xml_diff>
--- a/app/core/artifacts/resume_template.2.0.docx
+++ b/app/core/artifacts/resume_template.2.0.docx
@@ -4,65 +4,54 @@
   <w:body>
     <w:p>
       <w:pPr>
+        <w:keepLines w:val="1"/>
         <w:spacing w:line="240" w:lineRule="auto"/>
         <w:jc w:val="center"/>
         <w:rPr>
           <w:rFonts w:ascii="Times New Roman" w:cs="Times New Roman" w:eastAsia="Times New Roman" w:hAnsi="Times New Roman"/>
+        </w:rPr>
+      </w:pPr>
+      <w:r>
+        <w:rPr>
+          <w:rFonts w:ascii="Times New Roman" w:cs="Times New Roman" w:eastAsia="Times New Roman" w:hAnsi="Times New Roman"/>
           <w:sz w:val="40"/>
           <w:szCs w:val="40"/>
-        </w:rPr>
-      </w:pPr>
-      <w:r>
-        <w:rPr>
-          <w:rFonts w:ascii="Times New Roman" w:cs="Times New Roman" w:eastAsia="Times New Roman" w:hAnsi="Times New Roman"/>
-          <w:sz w:val="40"/>
-          <w:szCs w:val="40"/>
           <w:rtl w:val="0"/>
         </w:rPr>
         <w:t xml:space="preserve">{{profile.name}}</w:t>
       </w:r>
-    </w:p>
-    <w:p>
-      <w:pPr>
-        <w:keepLines w:val="0"/>
-        <w:spacing w:line="240" w:lineRule="auto"/>
+      <w:r>
+        <w:rPr>
+          <w:rtl w:val="0"/>
+        </w:rPr>
+      </w:r>
+    </w:p>
+    <w:p>
+      <w:pPr>
         <w:jc w:val="center"/>
         <w:rPr>
-          <w:sz w:val="26"/>
-          <w:szCs w:val="26"/>
-        </w:rPr>
-      </w:pPr>
-      <w:r>
-        <w:rPr>
-          <w:sz w:val="26"/>
-          <w:szCs w:val="26"/>
-          <w:rtl w:val="0"/>
-        </w:rPr>
-        <w:t xml:space="preserve">{{ profile.designation_line }}</w:t>
-      </w:r>
-    </w:p>
-    <w:p>
-      <w:pPr>
-        <w:spacing w:line="240" w:lineRule="auto"/>
-        <w:jc w:val="center"/>
-        <w:rPr>
-          <w:rFonts w:ascii="Times New Roman" w:cs="Times New Roman" w:eastAsia="Times New Roman" w:hAnsi="Times New Roman"/>
-        </w:rPr>
-      </w:pPr>
-      <w:r>
-        <w:rPr>
-          <w:rFonts w:ascii="Times New Roman" w:cs="Times New Roman" w:eastAsia="Times New Roman" w:hAnsi="Times New Roman"/>
-          <w:rtl w:val="0"/>
-        </w:rPr>
-        <w:t xml:space="preserve">{{ profile.contact_line }}</w:t>
-      </w:r>
-    </w:p>
-    <w:p>
-      <w:pPr>
+          <w:rFonts w:ascii="Times New Roman" w:cs="Times New Roman" w:eastAsia="Times New Roman" w:hAnsi="Times New Roman"/>
+          <w:sz w:val="24"/>
+          <w:szCs w:val="24"/>
+        </w:rPr>
+      </w:pPr>
+      <w:r>
+        <w:rPr>
+          <w:rFonts w:ascii="Times New Roman" w:cs="Times New Roman" w:eastAsia="Times New Roman" w:hAnsi="Times New Roman"/>
+          <w:sz w:val="24"/>
+          <w:szCs w:val="24"/>
+          <w:rtl w:val="0"/>
+        </w:rPr>
+        <w:t xml:space="preserve">{{r profile.contact_line}}</w:t>
+      </w:r>
+    </w:p>
+    <w:p>
+      <w:pPr>
+        <w:keepLines w:val="1"/>
         <w:pBdr>
           <w:bottom w:color="000000" w:space="1" w:sz="4" w:val="single"/>
         </w:pBdr>
-        <w:spacing w:line="276" w:lineRule="auto"/>
+        <w:spacing w:line="240" w:lineRule="auto"/>
         <w:jc w:val="center"/>
         <w:rPr>
           <w:rFonts w:ascii="Times New Roman" w:cs="Times New Roman" w:eastAsia="Times New Roman" w:hAnsi="Times New Roman"/>
@@ -86,7 +75,8 @@
     </w:p>
     <w:p>
       <w:pPr>
-        <w:spacing w:after="0" w:line="276" w:lineRule="auto"/>
+        <w:keepLines w:val="1"/>
+        <w:spacing w:after="0" w:line="240" w:lineRule="auto"/>
         <w:jc w:val="both"/>
         <w:rPr>
           <w:rFonts w:ascii="Times New Roman" w:cs="Times New Roman" w:eastAsia="Times New Roman" w:hAnsi="Times New Roman"/>
@@ -102,21 +92,24 @@
     </w:p>
     <w:p>
       <w:pPr>
-        <w:spacing w:after="0" w:line="276" w:lineRule="auto"/>
-        <w:jc w:val="both"/>
-        <w:rPr>
-          <w:rFonts w:ascii="Times New Roman" w:cs="Times New Roman" w:eastAsia="Times New Roman" w:hAnsi="Times New Roman"/>
-        </w:rPr>
-      </w:pPr>
-      <w:r>
-        <w:rPr>
-          <w:rtl w:val="0"/>
-        </w:rPr>
-      </w:r>
-    </w:p>
-    <w:p>
-      <w:pPr>
-        <w:spacing w:after="0" w:line="276" w:lineRule="auto"/>
+        <w:keepLines w:val="1"/>
+        <w:spacing w:after="0" w:line="240" w:lineRule="auto"/>
+        <w:jc w:val="both"/>
+        <w:rPr>
+          <w:rFonts w:ascii="Times New Roman" w:cs="Times New Roman" w:eastAsia="Times New Roman" w:hAnsi="Times New Roman"/>
+        </w:rPr>
+      </w:pPr>
+      <w:r>
+        <w:rPr>
+          <w:rtl w:val="0"/>
+        </w:rPr>
+      </w:r>
+    </w:p>
+    <w:p>
+      <w:pPr>
+        <w:keepLines w:val="1"/>
+        <w:widowControl w:val="0"/>
+        <w:spacing w:after="0" w:line="240" w:lineRule="auto"/>
         <w:jc w:val="both"/>
         <w:rPr>
           <w:rFonts w:ascii="Times New Roman" w:cs="Times New Roman" w:eastAsia="Times New Roman" w:hAnsi="Times New Roman"/>
@@ -132,10 +125,11 @@
     </w:p>
     <w:p>
       <w:pPr>
+        <w:keepLines w:val="1"/>
         <w:pBdr>
           <w:bottom w:color="000000" w:space="1" w:sz="4" w:val="single"/>
         </w:pBdr>
-        <w:spacing w:line="276" w:lineRule="auto"/>
+        <w:spacing w:line="240" w:lineRule="auto"/>
         <w:jc w:val="center"/>
         <w:rPr>
           <w:rFonts w:ascii="Times New Roman" w:cs="Times New Roman" w:eastAsia="Times New Roman" w:hAnsi="Times New Roman"/>
@@ -159,7 +153,8 @@
     </w:p>
     <w:p>
       <w:pPr>
-        <w:spacing w:after="0" w:line="276" w:lineRule="auto"/>
+        <w:keepLines w:val="1"/>
+        <w:spacing w:after="0" w:line="240" w:lineRule="auto"/>
         <w:rPr>
           <w:rFonts w:ascii="Times New Roman" w:cs="Times New Roman" w:eastAsia="Times New Roman" w:hAnsi="Times New Roman"/>
         </w:rPr>
@@ -174,44 +169,71 @@
     </w:p>
     <w:p>
       <w:pPr>
+        <w:keepLines w:val="1"/>
         <w:tabs>
           <w:tab w:val="right" w:leader="none" w:pos="10466"/>
         </w:tabs>
-        <w:spacing w:after="0" w:line="276" w:lineRule="auto"/>
-        <w:rPr>
-          <w:rFonts w:ascii="Times New Roman" w:cs="Times New Roman" w:eastAsia="Times New Roman" w:hAnsi="Times New Roman"/>
-          <w:b w:val="1"/>
-          <w:bCs w:val="1"/>
-        </w:rPr>
-      </w:pPr>
-      <w:r>
-        <w:rPr>
-          <w:rFonts w:ascii="Times New Roman" w:cs="Times New Roman" w:eastAsia="Times New Roman" w:hAnsi="Times New Roman"/>
-          <w:b w:val="1"/>
-          <w:bCs w:val="1"/>
-          <w:rtl w:val="0"/>
-        </w:rPr>
-        <w:t xml:space="preserve">{{exp.title}} </w:t>
-      </w:r>
-      <w:r>
-        <w:rPr>
-          <w:rFonts w:ascii="Times New Roman" w:cs="Times New Roman" w:eastAsia="Times New Roman" w:hAnsi="Times New Roman"/>
-          <w:rtl w:val="0"/>
-        </w:rPr>
-        <w:t xml:space="preserve">{{r exp.link}}</w:t>
-      </w:r>
-      <w:r>
-        <w:rPr>
-          <w:rtl w:val="0"/>
-        </w:rPr>
-      </w:r>
-    </w:p>
-    <w:p>
-      <w:pPr>
+        <w:spacing w:after="0" w:line="240" w:lineRule="auto"/>
+        <w:rPr>
+          <w:rFonts w:ascii="Times New Roman" w:cs="Times New Roman" w:eastAsia="Times New Roman" w:hAnsi="Times New Roman"/>
+          <w:b w:val="1"/>
+          <w:bCs w:val="1"/>
+          <w:color w:val="ffffff"/>
+        </w:rPr>
+      </w:pPr>
+      <w:r>
+        <w:rPr>
+          <w:rFonts w:ascii="Times New Roman" w:cs="Times New Roman" w:eastAsia="Times New Roman" w:hAnsi="Times New Roman"/>
+          <w:b w:val="1"/>
+          <w:bCs w:val="1"/>
+          <w:color w:val="ffffff"/>
+          <w:rtl w:val="0"/>
+        </w:rPr>
+        <w:t xml:space="preserve">.</w:t>
+      </w:r>
+    </w:p>
+    <w:p>
+      <w:pPr>
+        <w:keepLines w:val="1"/>
         <w:tabs>
           <w:tab w:val="right" w:leader="none" w:pos="10466"/>
         </w:tabs>
-        <w:spacing w:after="0" w:line="276" w:lineRule="auto"/>
+        <w:spacing w:after="0" w:line="240" w:lineRule="auto"/>
+        <w:rPr>
+          <w:rFonts w:ascii="Times New Roman" w:cs="Times New Roman" w:eastAsia="Times New Roman" w:hAnsi="Times New Roman"/>
+          <w:b w:val="1"/>
+          <w:bCs w:val="1"/>
+        </w:rPr>
+      </w:pPr>
+      <w:r>
+        <w:rPr>
+          <w:rFonts w:ascii="Times New Roman" w:cs="Times New Roman" w:eastAsia="Times New Roman" w:hAnsi="Times New Roman"/>
+          <w:b w:val="1"/>
+          <w:bCs w:val="1"/>
+          <w:rtl w:val="0"/>
+        </w:rPr>
+        <w:t xml:space="preserve">{{exp.title}} </w:t>
+      </w:r>
+      <w:r>
+        <w:rPr>
+          <w:rFonts w:ascii="Times New Roman" w:cs="Times New Roman" w:eastAsia="Times New Roman" w:hAnsi="Times New Roman"/>
+          <w:rtl w:val="0"/>
+        </w:rPr>
+        <w:t xml:space="preserve">{{r exp.link}}</w:t>
+      </w:r>
+      <w:r>
+        <w:rPr>
+          <w:rtl w:val="0"/>
+        </w:rPr>
+      </w:r>
+    </w:p>
+    <w:p>
+      <w:pPr>
+        <w:keepLines w:val="1"/>
+        <w:tabs>
+          <w:tab w:val="right" w:leader="none" w:pos="10466"/>
+        </w:tabs>
+        <w:spacing w:after="0" w:line="240" w:lineRule="auto"/>
         <w:rPr>
           <w:rFonts w:ascii="Times New Roman" w:cs="Times New Roman" w:eastAsia="Times New Roman" w:hAnsi="Times New Roman"/>
           <w:i w:val="1"/>
@@ -243,7 +265,8 @@
     </w:p>
     <w:p>
       <w:pPr>
-        <w:spacing w:line="276" w:lineRule="auto"/>
+        <w:keepLines w:val="1"/>
+        <w:spacing w:line="240" w:lineRule="auto"/>
         <w:jc w:val="both"/>
         <w:rPr>
           <w:rFonts w:ascii="Times New Roman" w:cs="Times New Roman" w:eastAsia="Times New Roman" w:hAnsi="Times New Roman"/>
@@ -260,7 +283,7 @@
     <w:p>
       <w:pPr>
         <w:keepNext w:val="0"/>
-        <w:keepLines w:val="0"/>
+        <w:keepLines w:val="1"/>
         <w:pageBreakBefore w:val="0"/>
         <w:widowControl w:val="1"/>
         <w:numPr>
@@ -275,13 +298,25 @@
           <w:between w:space="0" w:sz="0" w:val="nil"/>
         </w:pBdr>
         <w:shd w:fill="auto" w:val="clear"/>
-        <w:spacing w:after="160" w:before="0" w:line="276" w:lineRule="auto"/>
+        <w:spacing w:after="160" w:before="0" w:line="240" w:lineRule="auto"/>
         <w:ind w:left="360" w:right="0" w:hanging="360"/>
         <w:jc w:val="both"/>
         <w:rPr>
           <w:rFonts w:ascii="Times New Roman" w:cs="Times New Roman" w:eastAsia="Times New Roman" w:hAnsi="Times New Roman"/>
-          <w:b w:val="0"/>
-          <w:bCs w:val="0"/>
+          <w:i w:val="0"/>
+          <w:iCs w:val="0"/>
+          <w:smallCaps w:val="0"/>
+          <w:strike w:val="0"/>
+          <w:color w:val="000000"/>
+          <w:sz w:val="22"/>
+          <w:szCs w:val="22"/>
+          <w:shd w:fill="auto" w:val="clear"/>
+          <w:vertAlign w:val="baseline"/>
+        </w:rPr>
+      </w:pPr>
+      <w:r>
+        <w:rPr>
+          <w:rFonts w:ascii="Times New Roman" w:cs="Times New Roman" w:eastAsia="Times New Roman" w:hAnsi="Times New Roman"/>
           <w:i w:val="0"/>
           <w:iCs w:val="0"/>
           <w:smallCaps w:val="0"/>
@@ -292,23 +327,6 @@
           <w:u w:val="none"/>
           <w:shd w:fill="auto" w:val="clear"/>
           <w:vertAlign w:val="baseline"/>
-        </w:rPr>
-      </w:pPr>
-      <w:r>
-        <w:rPr>
-          <w:rFonts w:ascii="Times New Roman" w:cs="Times New Roman" w:eastAsia="Times New Roman" w:hAnsi="Times New Roman"/>
-          <w:b w:val="0"/>
-          <w:bCs w:val="0"/>
-          <w:i w:val="0"/>
-          <w:iCs w:val="0"/>
-          <w:smallCaps w:val="0"/>
-          <w:strike w:val="0"/>
-          <w:color w:val="000000"/>
-          <w:sz w:val="22"/>
-          <w:szCs w:val="22"/>
-          <w:u w:val="none"/>
-          <w:shd w:fill="auto" w:val="clear"/>
-          <w:vertAlign w:val="baseline"/>
           <w:rtl w:val="0"/>
         </w:rPr>
         <w:t xml:space="preserve">{{point}}</w:t>
@@ -316,7 +334,8 @@
     </w:p>
     <w:p>
       <w:pPr>
-        <w:spacing w:line="276" w:lineRule="auto"/>
+        <w:keepLines w:val="1"/>
+        <w:spacing w:line="240" w:lineRule="auto"/>
         <w:jc w:val="both"/>
         <w:rPr>
           <w:rFonts w:ascii="Times New Roman" w:cs="Times New Roman" w:eastAsia="Times New Roman" w:hAnsi="Times New Roman"/>
@@ -332,7 +351,8 @@
     </w:p>
     <w:p>
       <w:pPr>
-        <w:spacing w:line="276" w:lineRule="auto"/>
+        <w:keepLines w:val="1"/>
+        <w:spacing w:line="240" w:lineRule="auto"/>
         <w:jc w:val="both"/>
         <w:rPr>
           <w:rFonts w:ascii="Times New Roman" w:cs="Times New Roman" w:eastAsia="Times New Roman" w:hAnsi="Times New Roman"/>
@@ -348,7 +368,8 @@
     </w:p>
     <w:p>
       <w:pPr>
-        <w:spacing w:line="276" w:lineRule="auto"/>
+        <w:keepLines w:val="1"/>
+        <w:spacing w:line="240" w:lineRule="auto"/>
         <w:jc w:val="both"/>
         <w:rPr>
           <w:rFonts w:ascii="Times New Roman" w:cs="Times New Roman" w:eastAsia="Times New Roman" w:hAnsi="Times New Roman"/>
@@ -364,21 +385,23 @@
     </w:p>
     <w:p>
       <w:pPr>
-        <w:spacing w:line="276" w:lineRule="auto"/>
-        <w:jc w:val="both"/>
-        <w:rPr>
-          <w:rFonts w:ascii="Times New Roman" w:cs="Times New Roman" w:eastAsia="Times New Roman" w:hAnsi="Times New Roman"/>
-        </w:rPr>
-      </w:pPr>
-      <w:r>
-        <w:rPr>
-          <w:rtl w:val="0"/>
-        </w:rPr>
-      </w:r>
-    </w:p>
-    <w:p>
-      <w:pPr>
-        <w:spacing w:line="276" w:lineRule="auto"/>
+        <w:keepLines w:val="1"/>
+        <w:spacing w:line="240" w:lineRule="auto"/>
+        <w:jc w:val="both"/>
+        <w:rPr>
+          <w:rFonts w:ascii="Times New Roman" w:cs="Times New Roman" w:eastAsia="Times New Roman" w:hAnsi="Times New Roman"/>
+        </w:rPr>
+      </w:pPr>
+      <w:r>
+        <w:rPr>
+          <w:rtl w:val="0"/>
+        </w:rPr>
+      </w:r>
+    </w:p>
+    <w:p>
+      <w:pPr>
+        <w:keepLines w:val="1"/>
+        <w:spacing w:line="240" w:lineRule="auto"/>
         <w:jc w:val="both"/>
         <w:rPr>
           <w:rFonts w:ascii="Times New Roman" w:cs="Times New Roman" w:eastAsia="Times New Roman" w:hAnsi="Times New Roman"/>
@@ -394,10 +417,11 @@
     </w:p>
     <w:p>
       <w:pPr>
+        <w:keepLines w:val="1"/>
         <w:pBdr>
           <w:bottom w:color="000000" w:space="1" w:sz="4" w:val="single"/>
         </w:pBdr>
-        <w:spacing w:line="276" w:lineRule="auto"/>
+        <w:spacing w:line="240" w:lineRule="auto"/>
         <w:jc w:val="center"/>
         <w:rPr>
           <w:rFonts w:ascii="Times New Roman" w:cs="Times New Roman" w:eastAsia="Times New Roman" w:hAnsi="Times New Roman"/>
@@ -421,7 +445,8 @@
     </w:p>
     <w:p>
       <w:pPr>
-        <w:spacing w:after="0" w:line="276" w:lineRule="auto"/>
+        <w:keepLines w:val="1"/>
+        <w:spacing w:after="0" w:line="240" w:lineRule="auto"/>
         <w:rPr>
           <w:rFonts w:ascii="Times New Roman" w:cs="Times New Roman" w:eastAsia="Times New Roman" w:hAnsi="Times New Roman"/>
         </w:rPr>
@@ -436,44 +461,71 @@
     </w:p>
     <w:p>
       <w:pPr>
+        <w:keepLines w:val="1"/>
         <w:tabs>
           <w:tab w:val="right" w:leader="none" w:pos="10466"/>
         </w:tabs>
-        <w:spacing w:after="0" w:line="276" w:lineRule="auto"/>
-        <w:rPr>
-          <w:rFonts w:ascii="Times New Roman" w:cs="Times New Roman" w:eastAsia="Times New Roman" w:hAnsi="Times New Roman"/>
-          <w:b w:val="1"/>
-          <w:bCs w:val="1"/>
-        </w:rPr>
-      </w:pPr>
-      <w:r>
-        <w:rPr>
-          <w:rFonts w:ascii="Times New Roman" w:cs="Times New Roman" w:eastAsia="Times New Roman" w:hAnsi="Times New Roman"/>
-          <w:b w:val="1"/>
-          <w:bCs w:val="1"/>
-          <w:rtl w:val="0"/>
-        </w:rPr>
-        <w:t xml:space="preserve">{{proj.title}} </w:t>
-      </w:r>
-      <w:r>
-        <w:rPr>
-          <w:rFonts w:ascii="Times New Roman" w:cs="Times New Roman" w:eastAsia="Times New Roman" w:hAnsi="Times New Roman"/>
-          <w:rtl w:val="0"/>
-        </w:rPr>
-        <w:t xml:space="preserve">{{r proj.link}}</w:t>
-      </w:r>
-      <w:r>
-        <w:rPr>
-          <w:rtl w:val="0"/>
-        </w:rPr>
-      </w:r>
-    </w:p>
-    <w:p>
-      <w:pPr>
+        <w:spacing w:after="0" w:line="240" w:lineRule="auto"/>
+        <w:rPr>
+          <w:rFonts w:ascii="Times New Roman" w:cs="Times New Roman" w:eastAsia="Times New Roman" w:hAnsi="Times New Roman"/>
+          <w:b w:val="1"/>
+          <w:bCs w:val="1"/>
+          <w:color w:val="ffffff"/>
+        </w:rPr>
+      </w:pPr>
+      <w:r>
+        <w:rPr>
+          <w:rFonts w:ascii="Times New Roman" w:cs="Times New Roman" w:eastAsia="Times New Roman" w:hAnsi="Times New Roman"/>
+          <w:b w:val="1"/>
+          <w:bCs w:val="1"/>
+          <w:color w:val="ffffff"/>
+          <w:rtl w:val="0"/>
+        </w:rPr>
+        <w:t xml:space="preserve">.</w:t>
+      </w:r>
+    </w:p>
+    <w:p>
+      <w:pPr>
+        <w:keepLines w:val="1"/>
         <w:tabs>
           <w:tab w:val="right" w:leader="none" w:pos="10466"/>
         </w:tabs>
-        <w:spacing w:after="0" w:line="276" w:lineRule="auto"/>
+        <w:spacing w:after="0" w:line="240" w:lineRule="auto"/>
+        <w:rPr>
+          <w:rFonts w:ascii="Times New Roman" w:cs="Times New Roman" w:eastAsia="Times New Roman" w:hAnsi="Times New Roman"/>
+          <w:b w:val="1"/>
+          <w:bCs w:val="1"/>
+        </w:rPr>
+      </w:pPr>
+      <w:r>
+        <w:rPr>
+          <w:rFonts w:ascii="Times New Roman" w:cs="Times New Roman" w:eastAsia="Times New Roman" w:hAnsi="Times New Roman"/>
+          <w:b w:val="1"/>
+          <w:bCs w:val="1"/>
+          <w:rtl w:val="0"/>
+        </w:rPr>
+        <w:t xml:space="preserve">{{proj.title}} </w:t>
+      </w:r>
+      <w:r>
+        <w:rPr>
+          <w:rFonts w:ascii="Times New Roman" w:cs="Times New Roman" w:eastAsia="Times New Roman" w:hAnsi="Times New Roman"/>
+          <w:rtl w:val="0"/>
+        </w:rPr>
+        <w:t xml:space="preserve">{{r proj.link}}</w:t>
+      </w:r>
+      <w:r>
+        <w:rPr>
+          <w:rtl w:val="0"/>
+        </w:rPr>
+      </w:r>
+    </w:p>
+    <w:p>
+      <w:pPr>
+        <w:keepLines w:val="1"/>
+        <w:tabs>
+          <w:tab w:val="right" w:leader="none" w:pos="10466"/>
+        </w:tabs>
+        <w:spacing w:after="0" w:line="240" w:lineRule="auto"/>
         <w:rPr>
           <w:rFonts w:ascii="Times New Roman" w:cs="Times New Roman" w:eastAsia="Times New Roman" w:hAnsi="Times New Roman"/>
         </w:rPr>
@@ -506,7 +558,8 @@
     </w:p>
     <w:p>
       <w:pPr>
-        <w:spacing w:line="276" w:lineRule="auto"/>
+        <w:keepLines w:val="1"/>
+        <w:spacing w:line="240" w:lineRule="auto"/>
         <w:jc w:val="both"/>
         <w:rPr>
           <w:rFonts w:ascii="Times New Roman" w:cs="Times New Roman" w:eastAsia="Times New Roman" w:hAnsi="Times New Roman"/>
@@ -523,7 +576,7 @@
     <w:p>
       <w:pPr>
         <w:keepNext w:val="0"/>
-        <w:keepLines w:val="0"/>
+        <w:keepLines w:val="1"/>
         <w:pageBreakBefore w:val="0"/>
         <w:widowControl w:val="1"/>
         <w:numPr>
@@ -538,13 +591,25 @@
           <w:between w:space="0" w:sz="0" w:val="nil"/>
         </w:pBdr>
         <w:shd w:fill="auto" w:val="clear"/>
-        <w:spacing w:after="160" w:before="0" w:line="276" w:lineRule="auto"/>
+        <w:spacing w:after="160" w:before="0" w:line="240" w:lineRule="auto"/>
         <w:ind w:left="360" w:right="0" w:hanging="360"/>
         <w:jc w:val="both"/>
         <w:rPr>
           <w:rFonts w:ascii="Times New Roman" w:cs="Times New Roman" w:eastAsia="Times New Roman" w:hAnsi="Times New Roman"/>
-          <w:b w:val="0"/>
-          <w:bCs w:val="0"/>
+          <w:i w:val="0"/>
+          <w:iCs w:val="0"/>
+          <w:smallCaps w:val="0"/>
+          <w:strike w:val="0"/>
+          <w:color w:val="000000"/>
+          <w:sz w:val="22"/>
+          <w:szCs w:val="22"/>
+          <w:shd w:fill="auto" w:val="clear"/>
+          <w:vertAlign w:val="baseline"/>
+        </w:rPr>
+      </w:pPr>
+      <w:r>
+        <w:rPr>
+          <w:rFonts w:ascii="Times New Roman" w:cs="Times New Roman" w:eastAsia="Times New Roman" w:hAnsi="Times New Roman"/>
           <w:i w:val="0"/>
           <w:iCs w:val="0"/>
           <w:smallCaps w:val="0"/>
@@ -555,23 +620,6 @@
           <w:u w:val="none"/>
           <w:shd w:fill="auto" w:val="clear"/>
           <w:vertAlign w:val="baseline"/>
-        </w:rPr>
-      </w:pPr>
-      <w:r>
-        <w:rPr>
-          <w:rFonts w:ascii="Times New Roman" w:cs="Times New Roman" w:eastAsia="Times New Roman" w:hAnsi="Times New Roman"/>
-          <w:b w:val="0"/>
-          <w:bCs w:val="0"/>
-          <w:i w:val="0"/>
-          <w:iCs w:val="0"/>
-          <w:smallCaps w:val="0"/>
-          <w:strike w:val="0"/>
-          <w:color w:val="000000"/>
-          <w:sz w:val="22"/>
-          <w:szCs w:val="22"/>
-          <w:u w:val="none"/>
-          <w:shd w:fill="auto" w:val="clear"/>
-          <w:vertAlign w:val="baseline"/>
           <w:rtl w:val="0"/>
         </w:rPr>
         <w:t xml:space="preserve">{{point}}</w:t>
@@ -579,7 +627,8 @@
     </w:p>
     <w:p>
       <w:pPr>
-        <w:spacing w:line="276" w:lineRule="auto"/>
+        <w:keepLines w:val="1"/>
+        <w:spacing w:line="240" w:lineRule="auto"/>
         <w:jc w:val="both"/>
         <w:rPr>
           <w:rFonts w:ascii="Times New Roman" w:cs="Times New Roman" w:eastAsia="Times New Roman" w:hAnsi="Times New Roman"/>
@@ -595,7 +644,8 @@
     </w:p>
     <w:p>
       <w:pPr>
-        <w:spacing w:line="276" w:lineRule="auto"/>
+        <w:keepLines w:val="1"/>
+        <w:spacing w:line="240" w:lineRule="auto"/>
         <w:jc w:val="both"/>
         <w:rPr>
           <w:rFonts w:ascii="Times New Roman" w:cs="Times New Roman" w:eastAsia="Times New Roman" w:hAnsi="Times New Roman"/>
@@ -611,7 +661,8 @@
     </w:p>
     <w:p>
       <w:pPr>
-        <w:spacing w:line="276" w:lineRule="auto"/>
+        <w:keepLines w:val="1"/>
+        <w:spacing w:line="240" w:lineRule="auto"/>
         <w:jc w:val="both"/>
         <w:rPr>
           <w:rFonts w:ascii="Times New Roman" w:cs="Times New Roman" w:eastAsia="Times New Roman" w:hAnsi="Times New Roman"/>
@@ -627,21 +678,23 @@
     </w:p>
     <w:p>
       <w:pPr>
-        <w:spacing w:after="0" w:line="276" w:lineRule="auto"/>
-        <w:jc w:val="both"/>
-        <w:rPr>
-          <w:rFonts w:ascii="Times New Roman" w:cs="Times New Roman" w:eastAsia="Times New Roman" w:hAnsi="Times New Roman"/>
-        </w:rPr>
-      </w:pPr>
-      <w:r>
-        <w:rPr>
-          <w:rtl w:val="0"/>
-        </w:rPr>
-      </w:r>
-    </w:p>
-    <w:p>
-      <w:pPr>
-        <w:spacing w:line="276" w:lineRule="auto"/>
+        <w:keepLines w:val="1"/>
+        <w:spacing w:after="0" w:line="240" w:lineRule="auto"/>
+        <w:jc w:val="both"/>
+        <w:rPr>
+          <w:rFonts w:ascii="Times New Roman" w:cs="Times New Roman" w:eastAsia="Times New Roman" w:hAnsi="Times New Roman"/>
+        </w:rPr>
+      </w:pPr>
+      <w:r>
+        <w:rPr>
+          <w:rtl w:val="0"/>
+        </w:rPr>
+      </w:r>
+    </w:p>
+    <w:p>
+      <w:pPr>
+        <w:keepLines w:val="1"/>
+        <w:spacing w:line="240" w:lineRule="auto"/>
         <w:jc w:val="both"/>
         <w:rPr>
           <w:rFonts w:ascii="Times New Roman" w:cs="Times New Roman" w:eastAsia="Times New Roman" w:hAnsi="Times New Roman"/>
@@ -657,10 +710,11 @@
     </w:p>
     <w:p>
       <w:pPr>
+        <w:keepLines w:val="1"/>
         <w:pBdr>
           <w:bottom w:color="000000" w:space="1" w:sz="4" w:val="single"/>
         </w:pBdr>
-        <w:spacing w:line="276" w:lineRule="auto"/>
+        <w:spacing w:line="240" w:lineRule="auto"/>
         <w:jc w:val="center"/>
         <w:rPr>
           <w:rFonts w:ascii="Times New Roman" w:cs="Times New Roman" w:eastAsia="Times New Roman" w:hAnsi="Times New Roman"/>
@@ -684,7 +738,8 @@
     </w:p>
     <w:p>
       <w:pPr>
-        <w:spacing w:line="276" w:lineRule="auto"/>
+        <w:keepLines w:val="1"/>
+        <w:spacing w:line="240" w:lineRule="auto"/>
         <w:jc w:val="both"/>
         <w:rPr>
           <w:rFonts w:ascii="Times New Roman" w:cs="Times New Roman" w:eastAsia="Times New Roman" w:hAnsi="Times New Roman"/>
@@ -701,7 +756,7 @@
     <w:p>
       <w:pPr>
         <w:keepNext w:val="0"/>
-        <w:keepLines w:val="0"/>
+        <w:keepLines w:val="1"/>
         <w:pageBreakBefore w:val="0"/>
         <w:widowControl w:val="1"/>
         <w:numPr>
@@ -716,13 +771,25 @@
           <w:between w:space="0" w:sz="0" w:val="nil"/>
         </w:pBdr>
         <w:shd w:fill="auto" w:val="clear"/>
-        <w:spacing w:after="0" w:before="0" w:line="276" w:lineRule="auto"/>
+        <w:spacing w:after="0" w:before="0" w:line="240" w:lineRule="auto"/>
         <w:ind w:left="360" w:right="0" w:hanging="360"/>
         <w:jc w:val="both"/>
         <w:rPr>
           <w:rFonts w:ascii="Times New Roman" w:cs="Times New Roman" w:eastAsia="Times New Roman" w:hAnsi="Times New Roman"/>
-          <w:b w:val="0"/>
-          <w:bCs w:val="0"/>
+          <w:i w:val="0"/>
+          <w:iCs w:val="0"/>
+          <w:smallCaps w:val="0"/>
+          <w:strike w:val="0"/>
+          <w:color w:val="000000"/>
+          <w:sz w:val="22"/>
+          <w:szCs w:val="22"/>
+          <w:shd w:fill="auto" w:val="clear"/>
+          <w:vertAlign w:val="baseline"/>
+        </w:rPr>
+      </w:pPr>
+      <w:r>
+        <w:rPr>
+          <w:rFonts w:ascii="Times New Roman" w:cs="Times New Roman" w:eastAsia="Times New Roman" w:hAnsi="Times New Roman"/>
           <w:i w:val="0"/>
           <w:iCs w:val="0"/>
           <w:smallCaps w:val="0"/>
@@ -733,23 +800,6 @@
           <w:u w:val="none"/>
           <w:shd w:fill="auto" w:val="clear"/>
           <w:vertAlign w:val="baseline"/>
-        </w:rPr>
-      </w:pPr>
-      <w:r>
-        <w:rPr>
-          <w:rFonts w:ascii="Times New Roman" w:cs="Times New Roman" w:eastAsia="Times New Roman" w:hAnsi="Times New Roman"/>
-          <w:b w:val="0"/>
-          <w:bCs w:val="0"/>
-          <w:i w:val="0"/>
-          <w:iCs w:val="0"/>
-          <w:smallCaps w:val="0"/>
-          <w:strike w:val="0"/>
-          <w:color w:val="000000"/>
-          <w:sz w:val="22"/>
-          <w:szCs w:val="22"/>
-          <w:u w:val="none"/>
-          <w:shd w:fill="auto" w:val="clear"/>
-          <w:vertAlign w:val="baseline"/>
           <w:rtl w:val="0"/>
         </w:rPr>
         <w:t xml:space="preserve">{{point}}</w:t>
@@ -757,7 +807,8 @@
     </w:p>
     <w:p>
       <w:pPr>
-        <w:spacing w:after="0" w:line="276" w:lineRule="auto"/>
+        <w:keepLines w:val="1"/>
+        <w:spacing w:after="0" w:line="240" w:lineRule="auto"/>
         <w:jc w:val="both"/>
         <w:rPr>
           <w:rFonts w:ascii="Times New Roman" w:cs="Times New Roman" w:eastAsia="Times New Roman" w:hAnsi="Times New Roman"/>
@@ -773,7 +824,8 @@
     </w:p>
     <w:p>
       <w:pPr>
-        <w:spacing w:after="0" w:line="276" w:lineRule="auto"/>
+        <w:keepLines w:val="1"/>
+        <w:spacing w:after="0" w:line="240" w:lineRule="auto"/>
         <w:jc w:val="both"/>
         <w:rPr>
           <w:rFonts w:ascii="Times New Roman" w:cs="Times New Roman" w:eastAsia="Times New Roman" w:hAnsi="Times New Roman"/>
@@ -789,21 +841,23 @@
     </w:p>
     <w:p>
       <w:pPr>
-        <w:spacing w:after="0" w:line="276" w:lineRule="auto"/>
-        <w:jc w:val="both"/>
-        <w:rPr>
-          <w:rFonts w:ascii="Times New Roman" w:cs="Times New Roman" w:eastAsia="Times New Roman" w:hAnsi="Times New Roman"/>
-        </w:rPr>
-      </w:pPr>
-      <w:r>
-        <w:rPr>
-          <w:rtl w:val="0"/>
-        </w:rPr>
-      </w:r>
-    </w:p>
-    <w:p>
-      <w:pPr>
-        <w:spacing w:after="0" w:line="276" w:lineRule="auto"/>
+        <w:keepLines w:val="1"/>
+        <w:spacing w:after="0" w:line="240" w:lineRule="auto"/>
+        <w:jc w:val="both"/>
+        <w:rPr>
+          <w:rFonts w:ascii="Times New Roman" w:cs="Times New Roman" w:eastAsia="Times New Roman" w:hAnsi="Times New Roman"/>
+        </w:rPr>
+      </w:pPr>
+      <w:r>
+        <w:rPr>
+          <w:rtl w:val="0"/>
+        </w:rPr>
+      </w:r>
+    </w:p>
+    <w:p>
+      <w:pPr>
+        <w:keepLines w:val="1"/>
+        <w:spacing w:after="0" w:line="240" w:lineRule="auto"/>
         <w:jc w:val="both"/>
         <w:rPr>
           <w:rFonts w:ascii="Times New Roman" w:cs="Times New Roman" w:eastAsia="Times New Roman" w:hAnsi="Times New Roman"/>
@@ -819,10 +873,11 @@
     </w:p>
     <w:p>
       <w:pPr>
+        <w:keepLines w:val="1"/>
         <w:pBdr>
           <w:bottom w:color="000000" w:space="1" w:sz="4" w:val="single"/>
         </w:pBdr>
-        <w:spacing w:line="276" w:lineRule="auto"/>
+        <w:spacing w:line="240" w:lineRule="auto"/>
         <w:jc w:val="center"/>
         <w:rPr>
           <w:rFonts w:ascii="Times New Roman" w:cs="Times New Roman" w:eastAsia="Times New Roman" w:hAnsi="Times New Roman"/>
@@ -846,7 +901,8 @@
     </w:p>
     <w:p>
       <w:pPr>
-        <w:spacing w:after="0" w:line="276" w:lineRule="auto"/>
+        <w:keepLines w:val="1"/>
+        <w:spacing w:after="0" w:line="240" w:lineRule="auto"/>
         <w:rPr>
           <w:rFonts w:ascii="Times New Roman" w:cs="Times New Roman" w:eastAsia="Times New Roman" w:hAnsi="Times New Roman"/>
         </w:rPr>
@@ -861,10 +917,11 @@
     </w:p>
     <w:p>
       <w:pPr>
+        <w:keepLines w:val="1"/>
         <w:tabs>
           <w:tab w:val="right" w:leader="none" w:pos="10466"/>
         </w:tabs>
-        <w:spacing w:after="0" w:line="276" w:lineRule="auto"/>
+        <w:spacing w:after="0" w:line="240" w:lineRule="auto"/>
         <w:rPr>
           <w:rFonts w:ascii="Times New Roman" w:cs="Times New Roman" w:eastAsia="Times New Roman" w:hAnsi="Times New Roman"/>
           <w:b w:val="1"/>
@@ -896,10 +953,11 @@
     </w:p>
     <w:p>
       <w:pPr>
+        <w:keepLines w:val="1"/>
         <w:tabs>
           <w:tab w:val="right" w:leader="none" w:pos="10466"/>
         </w:tabs>
-        <w:spacing w:after="0" w:line="276" w:lineRule="auto"/>
+        <w:spacing w:after="0" w:line="240" w:lineRule="auto"/>
         <w:rPr>
           <w:rFonts w:ascii="Times New Roman" w:cs="Times New Roman" w:eastAsia="Times New Roman" w:hAnsi="Times New Roman"/>
         </w:rPr>
@@ -914,10 +972,11 @@
     </w:p>
     <w:p>
       <w:pPr>
+        <w:keepLines w:val="1"/>
         <w:tabs>
           <w:tab w:val="right" w:leader="none" w:pos="10466"/>
         </w:tabs>
-        <w:spacing w:after="0" w:line="276" w:lineRule="auto"/>
+        <w:spacing w:after="0" w:line="240" w:lineRule="auto"/>
         <w:rPr>
           <w:rFonts w:ascii="Times New Roman" w:cs="Times New Roman" w:eastAsia="Times New Roman" w:hAnsi="Times New Roman"/>
         </w:rPr>
@@ -932,10 +991,11 @@
     </w:p>
     <w:p>
       <w:pPr>
+        <w:keepLines w:val="1"/>
         <w:tabs>
           <w:tab w:val="right" w:leader="none" w:pos="10466"/>
         </w:tabs>
-        <w:spacing w:after="0" w:line="276" w:lineRule="auto"/>
+        <w:spacing w:after="0" w:line="240" w:lineRule="auto"/>
         <w:rPr>
           <w:rFonts w:ascii="Times New Roman" w:cs="Times New Roman" w:eastAsia="Times New Roman" w:hAnsi="Times New Roman"/>
         </w:rPr>
@@ -950,26 +1010,28 @@
     </w:p>
     <w:p>
       <w:pPr>
+        <w:keepLines w:val="1"/>
         <w:tabs>
           <w:tab w:val="right" w:leader="none" w:pos="10466"/>
         </w:tabs>
-        <w:spacing w:after="0" w:line="276" w:lineRule="auto"/>
-        <w:rPr>
-          <w:rFonts w:ascii="Times New Roman" w:cs="Times New Roman" w:eastAsia="Times New Roman" w:hAnsi="Times New Roman"/>
-        </w:rPr>
-      </w:pPr>
-      <w:r>
-        <w:rPr>
-          <w:rtl w:val="0"/>
-        </w:rPr>
-      </w:r>
-    </w:p>
-    <w:p>
-      <w:pPr>
+        <w:spacing w:after="0" w:line="240" w:lineRule="auto"/>
+        <w:rPr>
+          <w:rFonts w:ascii="Times New Roman" w:cs="Times New Roman" w:eastAsia="Times New Roman" w:hAnsi="Times New Roman"/>
+        </w:rPr>
+      </w:pPr>
+      <w:r>
+        <w:rPr>
+          <w:rtl w:val="0"/>
+        </w:rPr>
+      </w:r>
+    </w:p>
+    <w:p>
+      <w:pPr>
+        <w:keepLines w:val="1"/>
         <w:tabs>
           <w:tab w:val="right" w:leader="none" w:pos="10466"/>
         </w:tabs>
-        <w:spacing w:after="0" w:line="276" w:lineRule="auto"/>
+        <w:spacing w:after="0" w:line="240" w:lineRule="auto"/>
         <w:rPr>
           <w:rFonts w:ascii="Times New Roman" w:cs="Times New Roman" w:eastAsia="Times New Roman" w:hAnsi="Times New Roman"/>
           <w:b w:val="1"/>
@@ -991,10 +1053,11 @@
     </w:p>
     <w:p>
       <w:pPr>
+        <w:keepLines w:val="1"/>
         <w:pBdr>
           <w:bottom w:color="000000" w:space="1" w:sz="4" w:val="single"/>
         </w:pBdr>
-        <w:spacing w:line="276" w:lineRule="auto"/>
+        <w:spacing w:line="240" w:lineRule="auto"/>
         <w:jc w:val="center"/>
         <w:rPr>
           <w:rFonts w:ascii="Times New Roman" w:cs="Times New Roman" w:eastAsia="Times New Roman" w:hAnsi="Times New Roman"/>
@@ -1018,7 +1081,8 @@
     </w:p>
     <w:p>
       <w:pPr>
-        <w:spacing w:line="276" w:lineRule="auto"/>
+        <w:keepLines w:val="1"/>
+        <w:spacing w:line="240" w:lineRule="auto"/>
         <w:jc w:val="both"/>
         <w:rPr>
           <w:rFonts w:ascii="Times New Roman" w:cs="Times New Roman" w:eastAsia="Times New Roman" w:hAnsi="Times New Roman"/>
@@ -1035,7 +1099,7 @@
     <w:p>
       <w:pPr>
         <w:keepNext w:val="0"/>
-        <w:keepLines w:val="0"/>
+        <w:keepLines w:val="1"/>
         <w:pageBreakBefore w:val="0"/>
         <w:widowControl w:val="1"/>
         <w:numPr>
@@ -1050,13 +1114,25 @@
           <w:between w:space="0" w:sz="0" w:val="nil"/>
         </w:pBdr>
         <w:shd w:fill="auto" w:val="clear"/>
-        <w:spacing w:after="0" w:before="0" w:line="276" w:lineRule="auto"/>
+        <w:spacing w:after="0" w:before="0" w:line="240" w:lineRule="auto"/>
         <w:ind w:left="360" w:right="0" w:hanging="360"/>
         <w:jc w:val="both"/>
         <w:rPr>
           <w:rFonts w:ascii="Times New Roman" w:cs="Times New Roman" w:eastAsia="Times New Roman" w:hAnsi="Times New Roman"/>
-          <w:b w:val="0"/>
-          <w:bCs w:val="0"/>
+          <w:i w:val="0"/>
+          <w:iCs w:val="0"/>
+          <w:smallCaps w:val="0"/>
+          <w:strike w:val="0"/>
+          <w:color w:val="000000"/>
+          <w:sz w:val="22"/>
+          <w:szCs w:val="22"/>
+          <w:shd w:fill="auto" w:val="clear"/>
+          <w:vertAlign w:val="baseline"/>
+        </w:rPr>
+      </w:pPr>
+      <w:r>
+        <w:rPr>
+          <w:rFonts w:ascii="Times New Roman" w:cs="Times New Roman" w:eastAsia="Times New Roman" w:hAnsi="Times New Roman"/>
           <w:i w:val="0"/>
           <w:iCs w:val="0"/>
           <w:smallCaps w:val="0"/>
@@ -1067,23 +1143,6 @@
           <w:u w:val="none"/>
           <w:shd w:fill="auto" w:val="clear"/>
           <w:vertAlign w:val="baseline"/>
-        </w:rPr>
-      </w:pPr>
-      <w:r>
-        <w:rPr>
-          <w:rFonts w:ascii="Times New Roman" w:cs="Times New Roman" w:eastAsia="Times New Roman" w:hAnsi="Times New Roman"/>
-          <w:b w:val="0"/>
-          <w:bCs w:val="0"/>
-          <w:i w:val="0"/>
-          <w:iCs w:val="0"/>
-          <w:smallCaps w:val="0"/>
-          <w:strike w:val="0"/>
-          <w:color w:val="000000"/>
-          <w:sz w:val="22"/>
-          <w:szCs w:val="22"/>
-          <w:u w:val="none"/>
-          <w:shd w:fill="auto" w:val="clear"/>
-          <w:vertAlign w:val="baseline"/>
           <w:rtl w:val="0"/>
         </w:rPr>
         <w:t xml:space="preserve">{{point}}</w:t>
@@ -1091,7 +1150,8 @@
     </w:p>
     <w:p>
       <w:pPr>
-        <w:spacing w:after="0" w:line="276" w:lineRule="auto"/>
+        <w:keepLines w:val="1"/>
+        <w:spacing w:after="0" w:line="240" w:lineRule="auto"/>
         <w:jc w:val="both"/>
         <w:rPr>
           <w:rFonts w:ascii="Times New Roman" w:cs="Times New Roman" w:eastAsia="Times New Roman" w:hAnsi="Times New Roman"/>
@@ -1107,7 +1167,8 @@
     </w:p>
     <w:p>
       <w:pPr>
-        <w:spacing w:after="0" w:line="276" w:lineRule="auto"/>
+        <w:keepLines w:val="1"/>
+        <w:spacing w:after="0" w:line="240" w:lineRule="auto"/>
         <w:jc w:val="both"/>
         <w:rPr>
           <w:rFonts w:ascii="Times New Roman" w:cs="Times New Roman" w:eastAsia="Times New Roman" w:hAnsi="Times New Roman"/>
@@ -1123,21 +1184,23 @@
     </w:p>
     <w:p>
       <w:pPr>
-        <w:spacing w:after="0" w:line="276" w:lineRule="auto"/>
-        <w:jc w:val="both"/>
-        <w:rPr>
-          <w:rFonts w:ascii="Times New Roman" w:cs="Times New Roman" w:eastAsia="Times New Roman" w:hAnsi="Times New Roman"/>
-        </w:rPr>
-      </w:pPr>
-      <w:r>
-        <w:rPr>
-          <w:rtl w:val="0"/>
-        </w:rPr>
-      </w:r>
-    </w:p>
-    <w:p>
-      <w:pPr>
-        <w:spacing w:after="0" w:line="276" w:lineRule="auto"/>
+        <w:keepLines w:val="1"/>
+        <w:spacing w:after="0" w:line="240" w:lineRule="auto"/>
+        <w:jc w:val="both"/>
+        <w:rPr>
+          <w:rFonts w:ascii="Times New Roman" w:cs="Times New Roman" w:eastAsia="Times New Roman" w:hAnsi="Times New Roman"/>
+        </w:rPr>
+      </w:pPr>
+      <w:r>
+        <w:rPr>
+          <w:rtl w:val="0"/>
+        </w:rPr>
+      </w:r>
+    </w:p>
+    <w:p>
+      <w:pPr>
+        <w:keepLines w:val="1"/>
+        <w:spacing w:after="0" w:line="240" w:lineRule="auto"/>
         <w:jc w:val="both"/>
         <w:rPr>
           <w:rFonts w:ascii="Times New Roman" w:cs="Times New Roman" w:eastAsia="Times New Roman" w:hAnsi="Times New Roman"/>
@@ -1153,10 +1216,11 @@
     </w:p>
     <w:p>
       <w:pPr>
+        <w:keepLines w:val="1"/>
         <w:pBdr>
           <w:bottom w:color="000000" w:space="1" w:sz="4" w:val="single"/>
         </w:pBdr>
-        <w:spacing w:line="276" w:lineRule="auto"/>
+        <w:spacing w:line="240" w:lineRule="auto"/>
         <w:jc w:val="center"/>
         <w:rPr>
           <w:rFonts w:ascii="Times New Roman" w:cs="Times New Roman" w:eastAsia="Times New Roman" w:hAnsi="Times New Roman"/>
@@ -1180,7 +1244,8 @@
     </w:p>
     <w:p>
       <w:pPr>
-        <w:spacing w:after="0" w:line="276" w:lineRule="auto"/>
+        <w:keepLines w:val="1"/>
+        <w:spacing w:after="0" w:line="240" w:lineRule="auto"/>
         <w:rPr>
           <w:rFonts w:ascii="Times New Roman" w:cs="Times New Roman" w:eastAsia="Times New Roman" w:hAnsi="Times New Roman"/>
         </w:rPr>
@@ -1195,10 +1260,11 @@
     </w:p>
     <w:p>
       <w:pPr>
+        <w:keepLines w:val="1"/>
         <w:tabs>
           <w:tab w:val="right" w:leader="none" w:pos="10466"/>
         </w:tabs>
-        <w:spacing w:after="0" w:line="276" w:lineRule="auto"/>
+        <w:spacing w:after="0" w:line="240" w:lineRule="auto"/>
         <w:rPr>
           <w:rFonts w:ascii="Times New Roman" w:cs="Times New Roman" w:eastAsia="Times New Roman" w:hAnsi="Times New Roman"/>
           <w:i w:val="1"/>
@@ -1226,10 +1292,11 @@
     </w:p>
     <w:p>
       <w:pPr>
+        <w:keepLines w:val="1"/>
         <w:tabs>
           <w:tab w:val="right" w:leader="none" w:pos="10466"/>
         </w:tabs>
-        <w:spacing w:after="0" w:line="276" w:lineRule="auto"/>
+        <w:spacing w:after="0" w:line="240" w:lineRule="auto"/>
         <w:rPr>
           <w:rFonts w:ascii="Times New Roman" w:cs="Times New Roman" w:eastAsia="Times New Roman" w:hAnsi="Times New Roman"/>
           <w:b w:val="1"/>
@@ -1252,7 +1319,7 @@
     <w:p>
       <w:pPr>
         <w:keepNext w:val="0"/>
-        <w:keepLines w:val="0"/>
+        <w:keepLines w:val="1"/>
         <w:pageBreakBefore w:val="0"/>
         <w:widowControl w:val="1"/>
         <w:numPr>
@@ -1267,13 +1334,25 @@
           <w:between w:space="0" w:sz="0" w:val="nil"/>
         </w:pBdr>
         <w:shd w:fill="auto" w:val="clear"/>
-        <w:spacing w:after="160" w:before="0" w:line="276" w:lineRule="auto"/>
+        <w:spacing w:after="160" w:before="0" w:line="240" w:lineRule="auto"/>
         <w:ind w:left="360" w:right="0" w:hanging="360"/>
         <w:jc w:val="both"/>
         <w:rPr>
           <w:rFonts w:ascii="Times New Roman" w:cs="Times New Roman" w:eastAsia="Times New Roman" w:hAnsi="Times New Roman"/>
-          <w:b w:val="0"/>
-          <w:bCs w:val="0"/>
+          <w:i w:val="0"/>
+          <w:iCs w:val="0"/>
+          <w:smallCaps w:val="0"/>
+          <w:strike w:val="0"/>
+          <w:color w:val="000000"/>
+          <w:sz w:val="22"/>
+          <w:szCs w:val="22"/>
+          <w:shd w:fill="auto" w:val="clear"/>
+          <w:vertAlign w:val="baseline"/>
+        </w:rPr>
+      </w:pPr>
+      <w:r>
+        <w:rPr>
+          <w:rFonts w:ascii="Times New Roman" w:cs="Times New Roman" w:eastAsia="Times New Roman" w:hAnsi="Times New Roman"/>
           <w:i w:val="0"/>
           <w:iCs w:val="0"/>
           <w:smallCaps w:val="0"/>
@@ -1284,23 +1363,6 @@
           <w:u w:val="none"/>
           <w:shd w:fill="auto" w:val="clear"/>
           <w:vertAlign w:val="baseline"/>
-        </w:rPr>
-      </w:pPr>
-      <w:r>
-        <w:rPr>
-          <w:rFonts w:ascii="Times New Roman" w:cs="Times New Roman" w:eastAsia="Times New Roman" w:hAnsi="Times New Roman"/>
-          <w:b w:val="0"/>
-          <w:bCs w:val="0"/>
-          <w:i w:val="0"/>
-          <w:iCs w:val="0"/>
-          <w:smallCaps w:val="0"/>
-          <w:strike w:val="0"/>
-          <w:color w:val="000000"/>
-          <w:sz w:val="22"/>
-          <w:szCs w:val="22"/>
-          <w:u w:val="none"/>
-          <w:shd w:fill="auto" w:val="clear"/>
-          <w:vertAlign w:val="baseline"/>
           <w:rtl w:val="0"/>
         </w:rPr>
         <w:t xml:space="preserve">{{point}}</w:t>
@@ -1308,7 +1370,8 @@
     </w:p>
     <w:p>
       <w:pPr>
-        <w:spacing w:line="276" w:lineRule="auto"/>
+        <w:keepLines w:val="1"/>
+        <w:spacing w:line="240" w:lineRule="auto"/>
         <w:jc w:val="both"/>
         <w:rPr>
           <w:rFonts w:ascii="Times New Roman" w:cs="Times New Roman" w:eastAsia="Times New Roman" w:hAnsi="Times New Roman"/>
@@ -1324,7 +1387,8 @@
     </w:p>
     <w:p>
       <w:pPr>
-        <w:spacing w:line="276" w:lineRule="auto"/>
+        <w:keepLines w:val="1"/>
+        <w:spacing w:line="240" w:lineRule="auto"/>
         <w:jc w:val="both"/>
         <w:rPr>
           <w:rFonts w:ascii="Times New Roman" w:cs="Times New Roman" w:eastAsia="Times New Roman" w:hAnsi="Times New Roman"/>
@@ -1340,7 +1404,8 @@
     </w:p>
     <w:p>
       <w:pPr>
-        <w:spacing w:after="0" w:line="276" w:lineRule="auto"/>
+        <w:keepLines w:val="1"/>
+        <w:spacing w:after="0" w:line="240" w:lineRule="auto"/>
         <w:jc w:val="both"/>
         <w:rPr>
           <w:rFonts w:ascii="Times New Roman" w:cs="Times New Roman" w:eastAsia="Times New Roman" w:hAnsi="Times New Roman"/>
@@ -1356,31 +1421,40 @@
     </w:p>
     <w:p>
       <w:pPr>
-        <w:spacing w:after="0" w:line="276" w:lineRule="auto"/>
-        <w:jc w:val="both"/>
-        <w:rPr>
-          <w:rFonts w:ascii="Times New Roman" w:cs="Times New Roman" w:eastAsia="Times New Roman" w:hAnsi="Times New Roman"/>
-        </w:rPr>
-      </w:pPr>
-      <w:r>
-        <w:rPr>
-          <w:rtl w:val="0"/>
-        </w:rPr>
-      </w:r>
-    </w:p>
-    <w:p>
-      <w:pPr>
-        <w:rPr/>
-      </w:pPr>
-      <w:r>
-        <w:rPr>
-          <w:rtl w:val="0"/>
-        </w:rPr>
-      </w:r>
-    </w:p>
-    <w:p>
-      <w:pPr>
-        <w:rPr/>
+        <w:keepLines w:val="1"/>
+        <w:spacing w:after="0" w:line="240" w:lineRule="auto"/>
+        <w:jc w:val="both"/>
+        <w:rPr>
+          <w:rFonts w:ascii="Times New Roman" w:cs="Times New Roman" w:eastAsia="Times New Roman" w:hAnsi="Times New Roman"/>
+        </w:rPr>
+      </w:pPr>
+      <w:r>
+        <w:rPr>
+          <w:rtl w:val="0"/>
+        </w:rPr>
+      </w:r>
+    </w:p>
+    <w:p>
+      <w:pPr>
+        <w:keepLines w:val="1"/>
+        <w:spacing w:line="240" w:lineRule="auto"/>
+        <w:rPr>
+          <w:rFonts w:ascii="Times New Roman" w:cs="Times New Roman" w:eastAsia="Times New Roman" w:hAnsi="Times New Roman"/>
+        </w:rPr>
+      </w:pPr>
+      <w:r>
+        <w:rPr>
+          <w:rtl w:val="0"/>
+        </w:rPr>
+      </w:r>
+    </w:p>
+    <w:p>
+      <w:pPr>
+        <w:keepLines w:val="1"/>
+        <w:spacing w:line="240" w:lineRule="auto"/>
+        <w:rPr>
+          <w:rFonts w:ascii="Times New Roman" w:cs="Times New Roman" w:eastAsia="Times New Roman" w:hAnsi="Times New Roman"/>
+        </w:rPr>
       </w:pPr>
       <w:r>
         <w:rPr>

</xml_diff>